<commit_message>
Dijital unite sonu sorulari unite sonu formatinda eklendi
- Her tema icin ayri soru dosyasi (dijital/Kim11_tema-N-dijital-unite-sonu-sorulari.docx), yayinevi PDF'e cevirecek
- Unite sonu sorularina dijital sorular icin karekod alani eklendi
- Dijital dosyalardaki taslak notu kaldirildi, dijital tabloya unite sonu satirlari eklendi
</commit_message>
<xml_diff>
--- a/dijital/dijital_tablo_kim11.docx
+++ b/dijital/dijital_tablo_kim11.docx
@@ -1062,7 +1062,7 @@
                 <w:rFonts w:ascii="Times New Roman" w:hAnsi="Times New Roman" w:cs="Times New Roman"/>
                 <w:lang w:val="tr-TR"/>
               </w:rPr>
-              <w:t>Tema-2</w:t>
+              <w:t>Tema-1</w:t>
             </w:r>
           </w:p>
         </w:tc>
@@ -1083,7 +1083,7 @@
                 <w:rFonts w:ascii="Times New Roman" w:hAnsi="Times New Roman" w:cs="Times New Roman"/>
                 <w:lang w:val="tr-TR"/>
               </w:rPr>
-              <w:t>KİM.11.2.1. Tepkimelerin tersinir olabileceğine ilişkin gözlem yapabilme</w:t>
+              <w:t>Ünite sonu dijital değerlendirme soruları</w:t>
             </w:r>
           </w:p>
         </w:tc>
@@ -1104,7 +1104,7 @@
                 <w:rFonts w:ascii="Times New Roman" w:hAnsi="Times New Roman" w:cs="Times New Roman"/>
                 <w:lang w:val="tr-TR"/>
               </w:rPr>
-              <w:t>Video</w:t>
+              <w:t>PDF (soru dosyası)</w:t>
             </w:r>
           </w:p>
         </w:tc>
@@ -1125,7 +1125,7 @@
                 <w:rFonts w:ascii="Times New Roman" w:hAnsi="Times New Roman" w:cs="Times New Roman"/>
                 <w:lang w:val="tr-TR"/>
               </w:rPr>
-              <w:t>Öğrencilerin tepkimelerin tersinir olabileceğine ilişkin gözlem yapabilmeleri için video hazırlanır.</w:t>
+              <w:t>—</w:t>
             </w:r>
             <w:proofErr w:type="spellStart"/>
             <w:proofErr w:type="spellEnd"/>
@@ -1147,7 +1147,7 @@
               <w:rPr>
                 <w:rFonts w:ascii="Times New Roman" w:hAnsi="Times New Roman"/>
               </w:rPr>
-              <w:t>Kim11.2.1 karekod (Video)</w:t>
+              <w:t>Kim11_tema-1-dijital-unite-sonu-sorulari.docx; ünite sonu soruları formatında, yayınevi PDF’e dönüştürecek. Karekod ünite sonu soruları sayfasında.</w:t>
             </w:r>
           </w:p>
         </w:tc>
@@ -1192,7 +1192,7 @@
                 <w:rFonts w:ascii="Times New Roman" w:hAnsi="Times New Roman" w:cs="Times New Roman"/>
                 <w:lang w:val="tr-TR"/>
               </w:rPr>
-              <w:t>KİM.11.2.2. Tepkimelerdeki denge sürecine ilişkin bilimsel gözleme dayalı tahminde bulunabilme</w:t>
+              <w:t>KİM.11.2.1. Tepkimelerin tersinir olabileceğine ilişkin gözlem yapabilme</w:t>
             </w:r>
           </w:p>
         </w:tc>
@@ -1213,7 +1213,7 @@
                 <w:rFonts w:ascii="Times New Roman" w:hAnsi="Times New Roman" w:cs="Times New Roman"/>
                 <w:lang w:val="tr-TR"/>
               </w:rPr>
-              <w:t>Animasyon</w:t>
+              <w:t>Video</w:t>
             </w:r>
           </w:p>
         </w:tc>
@@ -1234,7 +1234,7 @@
                 <w:rFonts w:ascii="Times New Roman" w:hAnsi="Times New Roman" w:cs="Times New Roman"/>
                 <w:lang w:val="tr-TR"/>
               </w:rPr>
-              <w:t>Öğrencilerin tepkime denge sürecindeki ileri ve geri tepkime hızları ile ilgili tahminlerini oluşturup sonuç çıkarabilecekleri animasyon veya simülasyon hazırlanır.</w:t>
+              <w:t>Öğrencilerin tepkimelerin tersinir olabileceğine ilişkin gözlem yapabilmeleri için video hazırlanır.</w:t>
             </w:r>
             <w:proofErr w:type="spellStart"/>
             <w:proofErr w:type="spellEnd"/>
@@ -1256,7 +1256,7 @@
               <w:rPr>
                 <w:rFonts w:ascii="Times New Roman" w:hAnsi="Times New Roman"/>
               </w:rPr>
-              <w:t>Kim11.2.2 karekod (Animasyon)</w:t>
+              <w:t>Kim11.2.1 karekod (Video)</w:t>
             </w:r>
           </w:p>
         </w:tc>
@@ -1301,7 +1301,7 @@
                 <w:rFonts w:ascii="Times New Roman" w:hAnsi="Times New Roman" w:cs="Times New Roman"/>
                 <w:lang w:val="tr-TR"/>
               </w:rPr>
-              <w:t>KİM.11.2.3. Denge sabiti ifadesinin oluşturulmasına ilişkin tümevarımsal akıl yürütebilme</w:t>
+              <w:t>KİM.11.2.2. Tepkimelerdeki denge sürecine ilişkin bilimsel gözleme dayalı tahminde bulunabilme</w:t>
             </w:r>
           </w:p>
         </w:tc>
@@ -1322,7 +1322,7 @@
                 <w:rFonts w:ascii="Times New Roman" w:hAnsi="Times New Roman" w:cs="Times New Roman"/>
                 <w:lang w:val="tr-TR"/>
               </w:rPr>
-              <w:t>Etkileşimli İçerik</w:t>
+              <w:t>Animasyon</w:t>
             </w:r>
           </w:p>
         </w:tc>
@@ -1343,7 +1343,7 @@
                 <w:rFonts w:ascii="Times New Roman" w:hAnsi="Times New Roman" w:cs="Times New Roman"/>
                 <w:lang w:val="tr-TR"/>
               </w:rPr>
-              <w:t>Öğrencilerin farklı tepkimeler için denge sabiti ifadesini yazabileceği ve denge sabiti ile ilgili çıkarımlar yapabileceği etkileşimli bir simülasyon veya uygulama hazırlanır.</w:t>
+              <w:t>Öğrencilerin tepkime denge sürecindeki ileri ve geri tepkime hızları ile ilgili tahminlerini oluşturup sonuç çıkarabilecekleri animasyon veya simülasyon hazırlanır.</w:t>
             </w:r>
             <w:proofErr w:type="spellStart"/>
             <w:proofErr w:type="spellEnd"/>
@@ -1365,7 +1365,7 @@
               <w:rPr>
                 <w:rFonts w:ascii="Times New Roman" w:hAnsi="Times New Roman"/>
               </w:rPr>
-              <w:t>Kim11.2.3 karekod</w:t>
+              <w:t>Kim11.2.2 karekod (Animasyon)</w:t>
             </w:r>
           </w:p>
         </w:tc>
@@ -1410,7 +1410,7 @@
                 <w:rFonts w:ascii="Times New Roman" w:hAnsi="Times New Roman" w:cs="Times New Roman"/>
                 <w:lang w:val="tr-TR"/>
               </w:rPr>
-              <w:t>KİM.11.2.4. Tersinir tepkimelerin dengeye ulaşıp ulaşmadığını bilimsel veriye dayalı tahmin edebilme</w:t>
+              <w:t>KİM.11.2.3. Denge sabiti ifadesinin oluşturulmasına ilişkin tümevarımsal akıl yürütebilme</w:t>
             </w:r>
           </w:p>
         </w:tc>
@@ -1452,7 +1452,7 @@
                 <w:rFonts w:ascii="Times New Roman" w:hAnsi="Times New Roman" w:cs="Times New Roman"/>
                 <w:lang w:val="tr-TR"/>
               </w:rPr>
-              <w:t>Aynı tepkimenin bileşenlerinin farklı derişim örnekleri kullanılarak tepkimenin denge durumunu, dengede değilse tepkime yönünün belirlemesini sağlayan animasyon, simülasyon veya etkileşimli içerik hazırlanır.</w:t>
+              <w:t>Öğrencilerin farklı tepkimeler için denge sabiti ifadesini yazabileceği ve denge sabiti ile ilgili çıkarımlar yapabileceği etkileşimli bir simülasyon veya uygulama hazırlanır.</w:t>
             </w:r>
             <w:proofErr w:type="spellStart"/>
             <w:proofErr w:type="spellEnd"/>
@@ -1474,7 +1474,7 @@
               <w:rPr>
                 <w:rFonts w:ascii="Times New Roman" w:hAnsi="Times New Roman"/>
               </w:rPr>
-              <w:t>Kim11.2.4 karekod</w:t>
+              <w:t>Kim11.2.3 karekod</w:t>
             </w:r>
           </w:p>
         </w:tc>
@@ -1519,7 +1519,7 @@
                 <w:rFonts w:ascii="Times New Roman" w:hAnsi="Times New Roman" w:cs="Times New Roman"/>
                 <w:lang w:val="tr-TR"/>
               </w:rPr>
-              <w:t>KİM.11.2.5. Dengeye etki eden faktörleri bilimsel sorgulayabilme</w:t>
+              <w:t>KİM.11.2.4. Tersinir tepkimelerin dengeye ulaşıp ulaşmadığını bilimsel veriye dayalı tahmin edebilme</w:t>
             </w:r>
           </w:p>
         </w:tc>
@@ -1540,7 +1540,7 @@
                 <w:rFonts w:ascii="Times New Roman" w:hAnsi="Times New Roman" w:cs="Times New Roman"/>
                 <w:lang w:val="tr-TR"/>
               </w:rPr>
-              <w:t>Sanal Laboratuvar</w:t>
+              <w:t>Etkileşimli İçerik</w:t>
             </w:r>
           </w:p>
         </w:tc>
@@ -1561,7 +1561,7 @@
                 <w:rFonts w:ascii="Times New Roman" w:hAnsi="Times New Roman" w:cs="Times New Roman"/>
                 <w:lang w:val="tr-TR"/>
               </w:rPr>
-              <w:t>Öğrencilerin derişim, hacim, basınç gibi değişkenlerin dengeye etkisini gözlemleyebilecekleri sanal laboratuvar (simülasyon) veya video hazırlanır.</w:t>
+              <w:t>Aynı tepkimenin bileşenlerinin farklı derişim örnekleri kullanılarak tepkimenin denge durumunu, dengede değilse tepkime yönünün belirlemesini sağlayan animasyon, simülasyon veya etkileşimli içerik hazırlanır.</w:t>
             </w:r>
             <w:proofErr w:type="spellStart"/>
             <w:proofErr w:type="spellEnd"/>
@@ -1583,7 +1583,7 @@
               <w:rPr>
                 <w:rFonts w:ascii="Times New Roman" w:hAnsi="Times New Roman"/>
               </w:rPr>
-              <w:t>Kim11.2.5 karekod</w:t>
+              <w:t>Kim11.2.4 karekod</w:t>
             </w:r>
           </w:p>
         </w:tc>
@@ -1628,7 +1628,7 @@
                 <w:rFonts w:ascii="Times New Roman" w:hAnsi="Times New Roman" w:cs="Times New Roman"/>
                 <w:lang w:val="tr-TR"/>
               </w:rPr>
-              <w:t>KİM.11.2.6. Saf suyun otoiyonizasyonuna ilişkin bilimsel gözlem yapabilme</w:t>
+              <w:t>KİM.11.2.5. Dengeye etki eden faktörleri bilimsel sorgulayabilme</w:t>
             </w:r>
           </w:p>
         </w:tc>
@@ -1649,7 +1649,7 @@
                 <w:rFonts w:ascii="Times New Roman" w:hAnsi="Times New Roman" w:cs="Times New Roman"/>
                 <w:lang w:val="tr-TR"/>
               </w:rPr>
-              <w:t>Etkileşimli İçerik</w:t>
+              <w:t>Sanal Laboratuvar</w:t>
             </w:r>
           </w:p>
         </w:tc>
@@ -1670,7 +1670,7 @@
                 <w:rFonts w:ascii="Times New Roman" w:hAnsi="Times New Roman" w:cs="Times New Roman"/>
                 <w:lang w:val="tr-TR"/>
               </w:rPr>
-              <w:t>Öğrencilerden saf suyun pH değerini ve iyonlar çarpımı sabitini (25 °C, Ksu) kullanarak sudaki H3O+ ve OH- iyonlarının derişimini hesaplamaları için etkileşimli içerik hazırlanır.</w:t>
+              <w:t>Öğrencilerin derişim, hacim, basınç gibi değişkenlerin dengeye etkisini gözlemleyebilecekleri sanal laboratuvar (simülasyon) veya video hazırlanır.</w:t>
             </w:r>
             <w:proofErr w:type="spellStart"/>
             <w:proofErr w:type="spellEnd"/>
@@ -1692,7 +1692,7 @@
               <w:rPr>
                 <w:rFonts w:ascii="Times New Roman" w:hAnsi="Times New Roman"/>
               </w:rPr>
-              <w:t>Kim11.2.6 karekod</w:t>
+              <w:t>Kim11.2.5 karekod</w:t>
             </w:r>
           </w:p>
         </w:tc>
@@ -1737,7 +1737,7 @@
                 <w:rFonts w:ascii="Times New Roman" w:hAnsi="Times New Roman" w:cs="Times New Roman"/>
                 <w:lang w:val="tr-TR"/>
               </w:rPr>
-              <w:t>KİM.11.2.7. Asit ve baz teorilerini karşılaştırabilme</w:t>
+              <w:t>KİM.11.2.6. Saf suyun otoiyonizasyonuna ilişkin bilimsel gözlem yapabilme</w:t>
             </w:r>
           </w:p>
         </w:tc>
@@ -1779,7 +1779,7 @@
                 <w:rFonts w:ascii="Times New Roman" w:hAnsi="Times New Roman" w:cs="Times New Roman"/>
                 <w:lang w:val="tr-TR"/>
               </w:rPr>
-              <w:t>Brønsted-Lowry asit-baz tanımını kullanarak eşlenik asit-baz çiftlerinin bulunacağı etkileşimli içerik hazırlanır.</w:t>
+              <w:t>Öğrencilerden saf suyun pH değerini ve iyonlar çarpımı sabitini (25 °C, Ksu) kullanarak sudaki H3O+ ve OH- iyonlarının derişimini hesaplamaları için etkileşimli içerik hazırlanır.</w:t>
             </w:r>
             <w:proofErr w:type="spellStart"/>
             <w:proofErr w:type="spellEnd"/>
@@ -1801,7 +1801,7 @@
               <w:rPr>
                 <w:rFonts w:ascii="Times New Roman" w:hAnsi="Times New Roman"/>
               </w:rPr>
-              <w:t>Kim11.2.7 karekod</w:t>
+              <w:t>Kim11.2.6 karekod</w:t>
             </w:r>
           </w:p>
         </w:tc>
@@ -1846,7 +1846,7 @@
                 <w:rFonts w:ascii="Times New Roman" w:hAnsi="Times New Roman" w:cs="Times New Roman"/>
                 <w:lang w:val="tr-TR"/>
               </w:rPr>
-              <w:t>KİM.11.2.8. Asitlerin ve bazların kuvvetlerine ilişkin bilimsel sorgulama yapabilme</w:t>
+              <w:t>KİM.11.2.7. Asit ve baz teorilerini karşılaştırabilme</w:t>
             </w:r>
           </w:p>
         </w:tc>
@@ -1867,7 +1867,7 @@
                 <w:rFonts w:ascii="Times New Roman" w:hAnsi="Times New Roman" w:cs="Times New Roman"/>
                 <w:lang w:val="tr-TR"/>
               </w:rPr>
-              <w:t>Sanal Laboratuvar</w:t>
+              <w:t>Etkileşimli İçerik</w:t>
             </w:r>
           </w:p>
         </w:tc>
@@ -1888,7 +1888,7 @@
                 <w:rFonts w:ascii="Times New Roman" w:hAnsi="Times New Roman" w:cs="Times New Roman"/>
                 <w:lang w:val="tr-TR"/>
               </w:rPr>
-              <w:t>Öğrencilerin aynı sıcaklık ve derişimde farklı asit ve baz çözeltilerinin pH ve iletkenlik değerlerini ölçmeleri için sanal laboratuvar (simülasyon), animasyon veya etkileşimli içerik hazırlanır.</w:t>
+              <w:t>Brønsted-Lowry asit-baz tanımını kullanarak eşlenik asit-baz çiftlerinin bulunacağı etkileşimli içerik hazırlanır.</w:t>
             </w:r>
             <w:proofErr w:type="spellStart"/>
             <w:proofErr w:type="spellEnd"/>
@@ -1910,7 +1910,7 @@
               <w:rPr>
                 <w:rFonts w:ascii="Times New Roman" w:hAnsi="Times New Roman"/>
               </w:rPr>
-              <w:t>Kim11.2.8 karekod</w:t>
+              <w:t>Kim11.2.7 karekod</w:t>
             </w:r>
           </w:p>
         </w:tc>
@@ -1955,7 +1955,7 @@
                 <w:rFonts w:ascii="Times New Roman" w:hAnsi="Times New Roman" w:cs="Times New Roman"/>
                 <w:lang w:val="tr-TR"/>
               </w:rPr>
-              <w:t>KİM.11.2.9. Kuvvetli asit-zayıf asit ve kuvvetli baz-zayıf baz sulu çözeltilerindeki pH hesaplamalarını karşılaştırabilme</w:t>
+              <w:t>KİM.11.2.8. Asitlerin ve bazların kuvvetlerine ilişkin bilimsel sorgulama yapabilme</w:t>
             </w:r>
           </w:p>
         </w:tc>
@@ -1976,7 +1976,7 @@
                 <w:rFonts w:ascii="Times New Roman" w:hAnsi="Times New Roman" w:cs="Times New Roman"/>
                 <w:lang w:val="tr-TR"/>
               </w:rPr>
-              <w:t>Etkileşimli İçerik</w:t>
+              <w:t>Sanal Laboratuvar</w:t>
             </w:r>
           </w:p>
         </w:tc>
@@ -1997,7 +1997,7 @@
                 <w:rFonts w:ascii="Times New Roman" w:hAnsi="Times New Roman" w:cs="Times New Roman"/>
                 <w:lang w:val="tr-TR"/>
               </w:rPr>
-              <w:t>Aynı sıcaklıklarda, derişimleri aynı monofonksiyonel kuvvetli asit-baz ve zayıf asit-baz çözeltilerinin pH - H3O+ iyon derişimleriyle ilgili etkileşimli içerik hazırlanır.</w:t>
+              <w:t>Öğrencilerin aynı sıcaklık ve derişimde farklı asit ve baz çözeltilerinin pH ve iletkenlik değerlerini ölçmeleri için sanal laboratuvar (simülasyon), animasyon veya etkileşimli içerik hazırlanır.</w:t>
             </w:r>
             <w:proofErr w:type="spellStart"/>
             <w:proofErr w:type="spellEnd"/>
@@ -2019,7 +2019,7 @@
               <w:rPr>
                 <w:rFonts w:ascii="Times New Roman" w:hAnsi="Times New Roman"/>
               </w:rPr>
-              <w:t>Kim11.2.9 karekod</w:t>
+              <w:t>Kim11.2.8 karekod</w:t>
             </w:r>
           </w:p>
         </w:tc>
@@ -2064,7 +2064,7 @@
                 <w:rFonts w:ascii="Times New Roman" w:hAnsi="Times New Roman" w:cs="Times New Roman"/>
                 <w:lang w:val="tr-TR"/>
               </w:rPr>
-              <w:t>KİM.11.2.10. Nötralleşme olayını operasyonel tanımlayabilme</w:t>
+              <w:t>KİM.11.2.9. Kuvvetli asit-zayıf asit ve kuvvetli baz-zayıf baz sulu çözeltilerindeki pH hesaplamalarını karşılaştırabilme</w:t>
             </w:r>
           </w:p>
         </w:tc>
@@ -2085,7 +2085,7 @@
                 <w:rFonts w:ascii="Times New Roman" w:hAnsi="Times New Roman" w:cs="Times New Roman"/>
                 <w:lang w:val="tr-TR"/>
               </w:rPr>
-              <w:t>Sanal Laboratuvar</w:t>
+              <w:t>Etkileşimli İçerik</w:t>
             </w:r>
           </w:p>
         </w:tc>
@@ -2106,7 +2106,7 @@
                 <w:rFonts w:ascii="Times New Roman" w:hAnsi="Times New Roman" w:cs="Times New Roman"/>
                 <w:lang w:val="tr-TR"/>
               </w:rPr>
-              <w:t>Öğrencinin kuvvetli asit ve kuvvetli baz çözeltileri karıştırıldığında gerçekleşen tepkimedeki iletkenlik, pH değişimi ve indikatörün renk değişimi ölçütlerini gözlemleyebileceği sanal laboratuvar (simülasyon), animasyon, etkileşimli içerik veya video hazırlanır.</w:t>
+              <w:t>Aynı sıcaklıklarda, derişimleri aynı monofonksiyonel kuvvetli asit-baz ve zayıf asit-baz çözeltilerinin pH - H3O+ iyon derişimleriyle ilgili etkileşimli içerik hazırlanır.</w:t>
             </w:r>
             <w:proofErr w:type="spellStart"/>
             <w:proofErr w:type="spellEnd"/>
@@ -2128,7 +2128,7 @@
               <w:rPr>
                 <w:rFonts w:ascii="Times New Roman" w:hAnsi="Times New Roman"/>
               </w:rPr>
-              <w:t>Kim11.2.10 karekod</w:t>
+              <w:t>Kim11.2.9 karekod</w:t>
             </w:r>
           </w:p>
         </w:tc>
@@ -2173,7 +2173,7 @@
                 <w:rFonts w:ascii="Times New Roman" w:hAnsi="Times New Roman" w:cs="Times New Roman"/>
                 <w:lang w:val="tr-TR"/>
               </w:rPr>
-              <w:t>KİM.11.2.11. Kuvvetli asit ve kuvvetli baz çözeltilerinin derişimlerini titrasyon yöntemiyle belirlemeye yönelik deney yapabilme</w:t>
+              <w:t>KİM.11.2.10. Nötralleşme olayını operasyonel tanımlayabilme</w:t>
             </w:r>
           </w:p>
         </w:tc>
@@ -2215,7 +2215,7 @@
                 <w:rFonts w:ascii="Times New Roman" w:hAnsi="Times New Roman" w:cs="Times New Roman"/>
                 <w:lang w:val="tr-TR"/>
               </w:rPr>
-              <w:t>Öğrencinin derişim bilinen kuvvetli bir asit ya da kuvvetli baz çözeltisini kullanarak derişimi bilinmeyen kuvvetli bir asit ya da kuvvetli baz çözeltisinin derişimini belirlemeye yönelik titrasyon yapabileceği sanal laboratuvar (simülasyon), animasyon veya etkileşimli içerik hazırlanır.</w:t>
+              <w:t>Öğrencinin kuvvetli asit ve kuvvetli baz çözeltileri karıştırıldığında gerçekleşen tepkimedeki iletkenlik, pH değişimi ve indikatörün renk değişimi ölçütlerini gözlemleyebileceği sanal laboratuvar (simülasyon), animasyon, etkileşimli içerik veya video hazırlanır.</w:t>
             </w:r>
             <w:proofErr w:type="spellStart"/>
             <w:proofErr w:type="spellEnd"/>
@@ -2237,7 +2237,7 @@
               <w:rPr>
                 <w:rFonts w:ascii="Times New Roman" w:hAnsi="Times New Roman"/>
               </w:rPr>
-              <w:t>Kim11.2.11 karekod</w:t>
+              <w:t>Kim11.2.10 karekod</w:t>
             </w:r>
           </w:p>
         </w:tc>
@@ -2282,7 +2282,7 @@
                 <w:rFonts w:ascii="Times New Roman" w:hAnsi="Times New Roman" w:cs="Times New Roman"/>
                 <w:lang w:val="tr-TR"/>
               </w:rPr>
-              <w:t>KİM.11.2.12. Asidik ya da bazik ürünlerin en uygun olanına karar verebilme</w:t>
+              <w:t>KİM.11.2.11. Kuvvetli asit ve kuvvetli baz çözeltilerinin derişimlerini titrasyon yöntemiyle belirlemeye yönelik deney yapabilme</w:t>
             </w:r>
           </w:p>
         </w:tc>
@@ -2303,7 +2303,7 @@
                 <w:rFonts w:ascii="Times New Roman" w:hAnsi="Times New Roman" w:cs="Times New Roman"/>
                 <w:lang w:val="tr-TR"/>
               </w:rPr>
-              <w:t>Animasyon</w:t>
+              <w:t>Sanal Laboratuvar</w:t>
             </w:r>
           </w:p>
         </w:tc>
@@ -2324,7 +2324,7 @@
                 <w:rFonts w:ascii="Times New Roman" w:hAnsi="Times New Roman" w:cs="Times New Roman"/>
                 <w:lang w:val="tr-TR"/>
               </w:rPr>
-              <w:t>Günlük hayatta kullandığımız mide, ağız, diş ve cilt sağlığı ürünlerinin sağlığa zararlı ve yararlı yönlerini asidik ve bazik özellik bağlamında anlatan animasyon videosu hazırlanır.</w:t>
+              <w:t>Öğrencinin derişim bilinen kuvvetli bir asit ya da kuvvetli baz çözeltisini kullanarak derişimi bilinmeyen kuvvetli bir asit ya da kuvvetli baz çözeltisinin derişimini belirlemeye yönelik titrasyon yapabileceği sanal laboratuvar (simülasyon), animasyon veya etkileşimli içerik hazırlanır.</w:t>
             </w:r>
             <w:proofErr w:type="spellStart"/>
             <w:proofErr w:type="spellEnd"/>
@@ -2346,7 +2346,7 @@
               <w:rPr>
                 <w:rFonts w:ascii="Times New Roman" w:hAnsi="Times New Roman"/>
               </w:rPr>
-              <w:t>Kim11.2.12 karekod</w:t>
+              <w:t>Kim11.2.11 karekod</w:t>
             </w:r>
           </w:p>
         </w:tc>
@@ -2391,7 +2391,7 @@
                 <w:rFonts w:ascii="Times New Roman" w:hAnsi="Times New Roman" w:cs="Times New Roman"/>
                 <w:lang w:val="tr-TR"/>
               </w:rPr>
-              <w:t>KİM.11.2.13. Suda az çözünen tuzların çözünürlüğüne ilişkin model oluşturabilme</w:t>
+              <w:t>KİM.11.2.12. Asidik ya da bazik ürünlerin en uygun olanına karar verebilme</w:t>
             </w:r>
           </w:p>
         </w:tc>
@@ -2412,7 +2412,7 @@
                 <w:rFonts w:ascii="Times New Roman" w:hAnsi="Times New Roman" w:cs="Times New Roman"/>
                 <w:lang w:val="tr-TR"/>
               </w:rPr>
-              <w:t>Doküman (Çalışma Yaprağı) + Animasyon</w:t>
+              <w:t>Animasyon</w:t>
             </w:r>
           </w:p>
         </w:tc>
@@ -2433,7 +2433,7 @@
                 <w:rFonts w:ascii="Times New Roman" w:hAnsi="Times New Roman" w:cs="Times New Roman"/>
                 <w:lang w:val="tr-TR"/>
               </w:rPr>
-              <w:t>Çözünürlük çarpımı sabitlerini kullanarak suda az çözünen tuzların molar çözünürlüklerine ilişkin hesaplama yapabilecekleri çalışma yaprağı hazırlanır. / Suda az çözünen bir tuzun çözünme sürecine ilişkin mikro seviyede süreç aşamalarını gösteren deney videosu ve animasyon hazırlanır.</w:t>
+              <w:t>Günlük hayatta kullandığımız mide, ağız, diş ve cilt sağlığı ürünlerinin sağlığa zararlı ve yararlı yönlerini asidik ve bazik özellik bağlamında anlatan animasyon videosu hazırlanır.</w:t>
             </w:r>
             <w:proofErr w:type="spellStart"/>
             <w:proofErr w:type="spellEnd"/>
@@ -2455,7 +2455,7 @@
               <w:rPr>
                 <w:rFonts w:ascii="Times New Roman" w:hAnsi="Times New Roman"/>
               </w:rPr>
-              <w:t>Kim11.2.13 karekodları: Animasyon (Kim11.2.13), Çalışma Yaprağı (Kim11.2.13)</w:t>
+              <w:t>Kim11.2.12 karekod</w:t>
             </w:r>
           </w:p>
         </w:tc>
@@ -2500,7 +2500,7 @@
                 <w:rFonts w:ascii="Times New Roman" w:hAnsi="Times New Roman" w:cs="Times New Roman"/>
                 <w:lang w:val="tr-TR"/>
               </w:rPr>
-              <w:t>KİM.11.2.14. Suda az çözünen tuzların çözünürlüğüne etki eden faktörlere ilişkin bilimsel çıkarım yapabilme</w:t>
+              <w:t>KİM.11.2.13. Suda az çözünen tuzların çözünürlüğüne ilişkin model oluşturabilme</w:t>
             </w:r>
           </w:p>
         </w:tc>
@@ -2521,7 +2521,7 @@
                 <w:rFonts w:ascii="Times New Roman" w:hAnsi="Times New Roman" w:cs="Times New Roman"/>
                 <w:lang w:val="tr-TR"/>
               </w:rPr>
-              <w:t>Sanal Laboratuvar</w:t>
+              <w:t>Doküman (Çalışma Yaprağı) + Animasyon</w:t>
             </w:r>
           </w:p>
         </w:tc>
@@ -2542,7 +2542,7 @@
                 <w:rFonts w:ascii="Times New Roman" w:hAnsi="Times New Roman" w:cs="Times New Roman"/>
                 <w:lang w:val="tr-TR"/>
               </w:rPr>
-              <w:t>Öğrencinin ortak iyonun ve sıcaklığın çözünürlüğe etkisini belirleyebileceği sanal laboratuvar (simülasyon) hazırlanır.</w:t>
+              <w:t>Çözünürlük çarpımı sabitlerini kullanarak suda az çözünen tuzların molar çözünürlüklerine ilişkin hesaplama yapabilecekleri çalışma yaprağı hazırlanır. / Suda az çözünen bir tuzun çözünme sürecine ilişkin mikro seviyede süreç aşamalarını gösteren deney videosu ve animasyon hazırlanır.</w:t>
             </w:r>
             <w:proofErr w:type="spellStart"/>
             <w:proofErr w:type="spellEnd"/>
@@ -2564,7 +2564,7 @@
               <w:rPr>
                 <w:rFonts w:ascii="Times New Roman" w:hAnsi="Times New Roman"/>
               </w:rPr>
-              <w:t>Kim11.2.14 karekod: Sanal laboratuvar (Kim11.2.14)</w:t>
+              <w:t>Kim11.2.13 karekodları: Animasyon (Kim11.2.13), Çalışma Yaprağı (Kim11.2.13)</w:t>
             </w:r>
           </w:p>
         </w:tc>
@@ -2588,7 +2588,7 @@
                 <w:rFonts w:ascii="Times New Roman" w:hAnsi="Times New Roman" w:cs="Times New Roman"/>
                 <w:lang w:val="tr-TR"/>
               </w:rPr>
-              <w:t>Tema-3</w:t>
+              <w:t>Tema-2</w:t>
             </w:r>
           </w:p>
         </w:tc>
@@ -2609,7 +2609,7 @@
                 <w:rFonts w:ascii="Times New Roman" w:hAnsi="Times New Roman" w:cs="Times New Roman"/>
                 <w:lang w:val="tr-TR"/>
               </w:rPr>
-              <w:t>KİM.11.3.1. Evsel atıklardan fermantasyon yöntemi ile yeşil hidrojen enerjisi elde etme sürecine yönelik hipotez oluşturabilme</w:t>
+              <w:t>KİM.11.2.14. Suda az çözünen tuzların çözünürlüğüne etki eden faktörlere ilişkin bilimsel çıkarım yapabilme</w:t>
             </w:r>
           </w:p>
         </w:tc>
@@ -2630,7 +2630,7 @@
                 <w:rFonts w:ascii="Times New Roman" w:hAnsi="Times New Roman" w:cs="Times New Roman"/>
                 <w:lang w:val="tr-TR"/>
               </w:rPr>
-              <w:t>Video</w:t>
+              <w:t>Sanal Laboratuvar</w:t>
             </w:r>
           </w:p>
         </w:tc>
@@ -2651,7 +2651,7 @@
                 <w:rFonts w:ascii="Times New Roman" w:hAnsi="Times New Roman" w:cs="Times New Roman"/>
                 <w:lang w:val="tr-TR"/>
               </w:rPr>
-              <w:t>Seçilen evsel atıklardan fermantasyon ile yeşil hidrojen gazı elde etmeye yönelik deney videosu, animasyon veya simülasyon hazırlanır.</w:t>
+              <w:t>Öğrencinin ortak iyonun ve sıcaklığın çözünürlüğe etkisini belirleyebileceği sanal laboratuvar (simülasyon) hazırlanır.</w:t>
             </w:r>
             <w:proofErr w:type="spellStart"/>
             <w:proofErr w:type="spellEnd"/>
@@ -2673,7 +2673,7 @@
               <w:rPr>
                 <w:rFonts w:ascii="Times New Roman" w:hAnsi="Times New Roman"/>
               </w:rPr>
-              <w:t>Kim11.3.1 karekod (Video)</w:t>
+              <w:t>Kim11.2.14 karekod: Sanal laboratuvar (Kim11.2.14)</w:t>
             </w:r>
           </w:p>
         </w:tc>
@@ -2697,7 +2697,7 @@
                 <w:rFonts w:ascii="Times New Roman" w:hAnsi="Times New Roman" w:cs="Times New Roman"/>
                 <w:lang w:val="tr-TR"/>
               </w:rPr>
-              <w:t>Tema-3</w:t>
+              <w:t>Tema-2</w:t>
             </w:r>
           </w:p>
         </w:tc>
@@ -2718,7 +2718,7 @@
                 <w:rFonts w:ascii="Times New Roman" w:hAnsi="Times New Roman" w:cs="Times New Roman"/>
                 <w:lang w:val="tr-TR"/>
               </w:rPr>
-              <w:t>KİM.11.3.2. Nanoteknolojik ürünlerin seçimine yönelik eleştirel düşünebilme</w:t>
+              <w:t>Ünite sonu dijital değerlendirme soruları</w:t>
             </w:r>
           </w:p>
         </w:tc>
@@ -2739,7 +2739,7 @@
                 <w:rFonts w:ascii="Times New Roman" w:hAnsi="Times New Roman" w:cs="Times New Roman"/>
                 <w:lang w:val="tr-TR"/>
               </w:rPr>
-              <w:t>Etkileşimli İçerik</w:t>
+              <w:t>PDF (soru dosyası)</w:t>
             </w:r>
           </w:p>
         </w:tc>
@@ -2760,7 +2760,7 @@
                 <w:rFonts w:ascii="Times New Roman" w:hAnsi="Times New Roman" w:cs="Times New Roman"/>
                 <w:lang w:val="tr-TR"/>
               </w:rPr>
-              <w:t>Öğrencilerin nanoteknolojik ürünlerin potansiyel faydalarını ve olası zararlarını kanıtlarla destekleyerek sorgulamaları için etkileşimli içerik/video veya animasyon hazırlanır.</w:t>
+              <w:t>—</w:t>
             </w:r>
             <w:proofErr w:type="spellStart"/>
             <w:proofErr w:type="spellEnd"/>
@@ -2782,7 +2782,7 @@
               <w:rPr>
                 <w:rFonts w:ascii="Times New Roman" w:hAnsi="Times New Roman"/>
               </w:rPr>
-              <w:t>Kim11.3.2 karekod</w:t>
+              <w:t>Kim11_tema-2-dijital-unite-sonu-sorulari.docx; ünite sonu soruları formatında, yayınevi PDF’e dönüştürecek. Karekod ünite sonu soruları sayfasında.</w:t>
             </w:r>
           </w:p>
         </w:tc>
@@ -2827,7 +2827,7 @@
                 <w:rFonts w:ascii="Times New Roman" w:hAnsi="Times New Roman" w:cs="Times New Roman"/>
                 <w:lang w:val="tr-TR"/>
               </w:rPr>
-              <w:t>KİM.11.3.3. Mikroplastik ve nanoplastiklerin etkilerini sorgulayabilme</w:t>
+              <w:t>KİM.11.3.1. Evsel atıklardan fermantasyon yöntemi ile yeşil hidrojen enerjisi elde etme sürecine yönelik hipotez oluşturabilme</w:t>
             </w:r>
           </w:p>
         </w:tc>
@@ -2869,7 +2869,7 @@
                 <w:rFonts w:ascii="Times New Roman" w:hAnsi="Times New Roman" w:cs="Times New Roman"/>
                 <w:lang w:val="tr-TR"/>
               </w:rPr>
-              <w:t>Mikroplastik ve nanoplastiklerin ne olduğunu, çevreye ve insan sağlığına potansiyel faydası ve olası zararlı etkilerini ele alan bir video, animasyon veya etkileşimli içerik hazırlanır.</w:t>
+              <w:t>Seçilen evsel atıklardan fermantasyon ile yeşil hidrojen gazı elde etmeye yönelik deney videosu, animasyon veya simülasyon hazırlanır.</w:t>
             </w:r>
             <w:proofErr w:type="spellStart"/>
             <w:proofErr w:type="spellEnd"/>
@@ -2891,7 +2891,334 @@
               <w:rPr>
                 <w:rFonts w:ascii="Times New Roman" w:hAnsi="Times New Roman"/>
               </w:rPr>
+              <w:t>Kim11.3.1 karekod (Video)</w:t>
+            </w:r>
+          </w:p>
+        </w:tc>
+      </w:tr>
+      <w:tr>
+        <w:tc>
+          <w:tcPr>
+            <w:tcW w:w="1129" w:type="dxa"/>
+            <w:shd w:val="clear" w:color="auto" w:fill="FFC000"/>
+          </w:tcPr>
+          <w:p>
+            <w:pPr>
+              <w:jc w:val="both"/>
+              <w:rPr>
+                <w:rFonts w:ascii="Times New Roman" w:hAnsi="Times New Roman" w:cs="Times New Roman"/>
+                <w:lang w:val="tr-TR"/>
+              </w:rPr>
+            </w:pPr>
+            <w:r>
+              <w:rPr>
+                <w:rFonts w:ascii="Times New Roman" w:hAnsi="Times New Roman" w:cs="Times New Roman"/>
+                <w:lang w:val="tr-TR"/>
+              </w:rPr>
+              <w:t>Tema-3</w:t>
+            </w:r>
+          </w:p>
+        </w:tc>
+        <w:tc>
+          <w:tcPr>
+            <w:tcW w:w="2552" w:type="dxa"/>
+          </w:tcPr>
+          <w:p>
+            <w:pPr>
+              <w:jc w:val="both"/>
+              <w:rPr>
+                <w:rFonts w:ascii="Times New Roman" w:hAnsi="Times New Roman" w:cs="Times New Roman"/>
+                <w:lang w:val="tr-TR"/>
+              </w:rPr>
+            </w:pPr>
+            <w:r>
+              <w:rPr>
+                <w:rFonts w:ascii="Times New Roman" w:hAnsi="Times New Roman" w:cs="Times New Roman"/>
+                <w:lang w:val="tr-TR"/>
+              </w:rPr>
+              <w:t>KİM.11.3.2. Nanoteknolojik ürünlerin seçimine yönelik eleştirel düşünebilme</w:t>
+            </w:r>
+          </w:p>
+        </w:tc>
+        <w:tc>
+          <w:tcPr>
+            <w:tcW w:w="1049" w:type="dxa"/>
+          </w:tcPr>
+          <w:p>
+            <w:pPr>
+              <w:jc w:val="both"/>
+              <w:rPr>
+                <w:rFonts w:ascii="Times New Roman" w:hAnsi="Times New Roman" w:cs="Times New Roman"/>
+                <w:lang w:val="tr-TR"/>
+              </w:rPr>
+            </w:pPr>
+            <w:r>
+              <w:rPr>
+                <w:rFonts w:ascii="Times New Roman" w:hAnsi="Times New Roman" w:cs="Times New Roman"/>
+                <w:lang w:val="tr-TR"/>
+              </w:rPr>
+              <w:t>Etkileşimli İçerik</w:t>
+            </w:r>
+          </w:p>
+        </w:tc>
+        <w:tc>
+          <w:tcPr>
+            <w:tcW w:w="3487" w:type="dxa"/>
+          </w:tcPr>
+          <w:p>
+            <w:pPr>
+              <w:jc w:val="both"/>
+              <w:rPr>
+                <w:rFonts w:ascii="Times New Roman" w:hAnsi="Times New Roman" w:cs="Times New Roman"/>
+                <w:lang w:val="tr-TR"/>
+              </w:rPr>
+            </w:pPr>
+            <w:r>
+              <w:rPr>
+                <w:rFonts w:ascii="Times New Roman" w:hAnsi="Times New Roman" w:cs="Times New Roman"/>
+                <w:lang w:val="tr-TR"/>
+              </w:rPr>
+              <w:t>Öğrencilerin nanoteknolojik ürünlerin potansiyel faydalarını ve olası zararlarını kanıtlarla destekleyerek sorgulamaları için etkileşimli içerik/video veya animasyon hazırlanır.</w:t>
+            </w:r>
+            <w:proofErr w:type="spellStart"/>
+            <w:proofErr w:type="spellEnd"/>
+          </w:p>
+        </w:tc>
+        <w:tc>
+          <w:tcPr>
+            <w:tcW w:w="1133" w:type="dxa"/>
+          </w:tcPr>
+          <w:p>
+            <w:pPr>
+              <w:jc w:val="both"/>
+              <w:rPr>
+                <w:rFonts w:ascii="Times New Roman" w:hAnsi="Times New Roman" w:cs="Times New Roman"/>
+                <w:lang w:val="tr-TR"/>
+              </w:rPr>
+            </w:pPr>
+            <w:r>
+              <w:rPr>
+                <w:rFonts w:ascii="Times New Roman" w:hAnsi="Times New Roman"/>
+              </w:rPr>
+              <w:t>Kim11.3.2 karekod</w:t>
+            </w:r>
+          </w:p>
+        </w:tc>
+      </w:tr>
+      <w:tr>
+        <w:tc>
+          <w:tcPr>
+            <w:tcW w:w="1129" w:type="dxa"/>
+            <w:shd w:val="clear" w:color="auto" w:fill="FFC000"/>
+          </w:tcPr>
+          <w:p>
+            <w:pPr>
+              <w:jc w:val="both"/>
+              <w:rPr>
+                <w:rFonts w:ascii="Times New Roman" w:hAnsi="Times New Roman" w:cs="Times New Roman"/>
+                <w:lang w:val="tr-TR"/>
+              </w:rPr>
+            </w:pPr>
+            <w:r>
+              <w:rPr>
+                <w:rFonts w:ascii="Times New Roman" w:hAnsi="Times New Roman" w:cs="Times New Roman"/>
+                <w:lang w:val="tr-TR"/>
+              </w:rPr>
+              <w:t>Tema-3</w:t>
+            </w:r>
+          </w:p>
+        </w:tc>
+        <w:tc>
+          <w:tcPr>
+            <w:tcW w:w="2552" w:type="dxa"/>
+          </w:tcPr>
+          <w:p>
+            <w:pPr>
+              <w:jc w:val="both"/>
+              <w:rPr>
+                <w:rFonts w:ascii="Times New Roman" w:hAnsi="Times New Roman" w:cs="Times New Roman"/>
+                <w:lang w:val="tr-TR"/>
+              </w:rPr>
+            </w:pPr>
+            <w:r>
+              <w:rPr>
+                <w:rFonts w:ascii="Times New Roman" w:hAnsi="Times New Roman" w:cs="Times New Roman"/>
+                <w:lang w:val="tr-TR"/>
+              </w:rPr>
+              <w:t>KİM.11.3.3. Mikroplastik ve nanoplastiklerin etkilerini sorgulayabilme</w:t>
+            </w:r>
+          </w:p>
+        </w:tc>
+        <w:tc>
+          <w:tcPr>
+            <w:tcW w:w="1049" w:type="dxa"/>
+          </w:tcPr>
+          <w:p>
+            <w:pPr>
+              <w:jc w:val="both"/>
+              <w:rPr>
+                <w:rFonts w:ascii="Times New Roman" w:hAnsi="Times New Roman" w:cs="Times New Roman"/>
+                <w:lang w:val="tr-TR"/>
+              </w:rPr>
+            </w:pPr>
+            <w:r>
+              <w:rPr>
+                <w:rFonts w:ascii="Times New Roman" w:hAnsi="Times New Roman" w:cs="Times New Roman"/>
+                <w:lang w:val="tr-TR"/>
+              </w:rPr>
+              <w:t>Video</w:t>
+            </w:r>
+          </w:p>
+        </w:tc>
+        <w:tc>
+          <w:tcPr>
+            <w:tcW w:w="3487" w:type="dxa"/>
+          </w:tcPr>
+          <w:p>
+            <w:pPr>
+              <w:jc w:val="both"/>
+              <w:rPr>
+                <w:rFonts w:ascii="Times New Roman" w:hAnsi="Times New Roman" w:cs="Times New Roman"/>
+                <w:lang w:val="tr-TR"/>
+              </w:rPr>
+            </w:pPr>
+            <w:r>
+              <w:rPr>
+                <w:rFonts w:ascii="Times New Roman" w:hAnsi="Times New Roman" w:cs="Times New Roman"/>
+                <w:lang w:val="tr-TR"/>
+              </w:rPr>
+              <w:t>Mikroplastik ve nanoplastiklerin ne olduğunu, çevreye ve insan sağlığına potansiyel faydası ve olası zararlı etkilerini ele alan bir video, animasyon veya etkileşimli içerik hazırlanır.</w:t>
+            </w:r>
+            <w:proofErr w:type="spellStart"/>
+            <w:proofErr w:type="spellEnd"/>
+          </w:p>
+        </w:tc>
+        <w:tc>
+          <w:tcPr>
+            <w:tcW w:w="1133" w:type="dxa"/>
+          </w:tcPr>
+          <w:p>
+            <w:pPr>
+              <w:jc w:val="both"/>
+              <w:rPr>
+                <w:rFonts w:ascii="Times New Roman" w:hAnsi="Times New Roman" w:cs="Times New Roman"/>
+                <w:lang w:val="tr-TR"/>
+              </w:rPr>
+            </w:pPr>
+            <w:r>
+              <w:rPr>
+                <w:rFonts w:ascii="Times New Roman" w:hAnsi="Times New Roman"/>
+              </w:rPr>
               <w:t>Kim11.3.3 karekod (Video)</w:t>
+            </w:r>
+          </w:p>
+        </w:tc>
+      </w:tr>
+      <w:tr>
+        <w:tc>
+          <w:tcPr>
+            <w:tcW w:w="1129" w:type="dxa"/>
+            <w:shd w:val="clear" w:color="auto" w:fill="FFC000"/>
+          </w:tcPr>
+          <w:p>
+            <w:pPr>
+              <w:jc w:val="both"/>
+              <w:rPr>
+                <w:rFonts w:ascii="Times New Roman" w:hAnsi="Times New Roman" w:cs="Times New Roman"/>
+                <w:lang w:val="tr-TR"/>
+              </w:rPr>
+            </w:pPr>
+            <w:r>
+              <w:rPr>
+                <w:rFonts w:ascii="Times New Roman" w:hAnsi="Times New Roman" w:cs="Times New Roman"/>
+                <w:lang w:val="tr-TR"/>
+              </w:rPr>
+              <w:t>Tema-3</w:t>
+            </w:r>
+          </w:p>
+        </w:tc>
+        <w:tc>
+          <w:tcPr>
+            <w:tcW w:w="2552" w:type="dxa"/>
+          </w:tcPr>
+          <w:p>
+            <w:pPr>
+              <w:jc w:val="both"/>
+              <w:rPr>
+                <w:rFonts w:ascii="Times New Roman" w:hAnsi="Times New Roman" w:cs="Times New Roman"/>
+                <w:lang w:val="tr-TR"/>
+              </w:rPr>
+            </w:pPr>
+            <w:r>
+              <w:rPr>
+                <w:rFonts w:ascii="Times New Roman" w:hAnsi="Times New Roman" w:cs="Times New Roman"/>
+                <w:lang w:val="tr-TR"/>
+              </w:rPr>
+              <w:t>Ünite sonu dijital değerlendirme soruları</w:t>
+            </w:r>
+          </w:p>
+        </w:tc>
+        <w:tc>
+          <w:tcPr>
+            <w:tcW w:w="1049" w:type="dxa"/>
+          </w:tcPr>
+          <w:p>
+            <w:pPr>
+              <w:jc w:val="both"/>
+              <w:rPr>
+                <w:rFonts w:ascii="Times New Roman" w:hAnsi="Times New Roman" w:cs="Times New Roman"/>
+                <w:lang w:val="tr-TR"/>
+              </w:rPr>
+            </w:pPr>
+            <w:r>
+              <w:rPr>
+                <w:rFonts w:ascii="Times New Roman" w:hAnsi="Times New Roman" w:cs="Times New Roman"/>
+                <w:lang w:val="tr-TR"/>
+              </w:rPr>
+              <w:t>PDF (soru dosyası)</w:t>
+            </w:r>
+          </w:p>
+        </w:tc>
+        <w:tc>
+          <w:tcPr>
+            <w:tcW w:w="3487" w:type="dxa"/>
+          </w:tcPr>
+          <w:p>
+            <w:pPr>
+              <w:jc w:val="both"/>
+              <w:rPr>
+                <w:rFonts w:ascii="Times New Roman" w:hAnsi="Times New Roman" w:cs="Times New Roman"/>
+                <w:lang w:val="tr-TR"/>
+              </w:rPr>
+            </w:pPr>
+            <w:r>
+              <w:rPr>
+                <w:rFonts w:ascii="Times New Roman" w:hAnsi="Times New Roman" w:cs="Times New Roman"/>
+                <w:lang w:val="tr-TR"/>
+              </w:rPr>
+              <w:t>—</w:t>
+            </w:r>
+            <w:proofErr w:type="spellStart"/>
+            <w:proofErr w:type="spellEnd"/>
+          </w:p>
+        </w:tc>
+        <w:tc>
+          <w:tcPr>
+            <w:tcW w:w="1133" w:type="dxa"/>
+          </w:tcPr>
+          <w:p>
+            <w:pPr>
+              <w:jc w:val="both"/>
+              <w:rPr>
+                <w:rFonts w:ascii="Times New Roman" w:hAnsi="Times New Roman" w:cs="Times New Roman"/>
+                <w:lang w:val="tr-TR"/>
+              </w:rPr>
+            </w:pPr>
+            <w:r>
+              <w:rPr>
+                <w:rFonts w:ascii="Times New Roman" w:hAnsi="Times New Roman"/>
+              </w:rPr>
+              <w:t>Kim11_tema-3-dijital-unite-sonu-sorulari.docx; ünite sonu soruları formatında, yayınevi PDF’e dönüştürecek. Karekod ünite sonu soruları sayfasında.</w:t>
             </w:r>
           </w:p>
         </w:tc>

</xml_diff>